<commit_message>
fall26 lab doc update
</commit_message>
<xml_diff>
--- a/Lab07AReport.docx
+++ b/Lab07AReport.docx
@@ -156,7 +156,7 @@
           <w:sz w:val="24"/>
           <w:szCs w:val="24"/>
         </w:rPr>
-        <w:t>5</w:t>
+        <w:t>6</w:t>
       </w:r>
     </w:p>
     <w:p>
@@ -511,7 +511,15 @@
           <w:color w:val="000000"/>
           <w:szCs w:val="24"/>
         </w:rPr>
-        <w:t xml:space="preserve"> BOM</w:t>
+        <w:t xml:space="preserve"> </w:t>
+      </w:r>
+      <w:r>
+        <w:rPr>
+          <w:rFonts w:ascii="Times New Roman" w:hAnsi="Times New Roman"/>
+          <w:color w:val="000000"/>
+          <w:szCs w:val="24"/>
+        </w:rPr>
+        <w:t>MSPM0_Pins_Assignments.xlsx</w:t>
       </w:r>
       <w:r>
         <w:rPr>
@@ -589,7 +597,55 @@
           <w:color w:val="000000"/>
           <w:szCs w:val="24"/>
         </w:rPr>
-        <w:t xml:space="preserve">List the needed supply voltages and estimated current for each voltage (show how these were determined). </w:t>
+        <w:t>I have pushed</w:t>
+      </w:r>
+      <w:r>
+        <w:rPr>
+          <w:rFonts w:ascii="Times New Roman" w:hAnsi="Times New Roman"/>
+          <w:color w:val="000000"/>
+          <w:szCs w:val="24"/>
+        </w:rPr>
+        <w:t xml:space="preserve"> my </w:t>
+      </w:r>
+      <w:r>
+        <w:rPr>
+          <w:rFonts w:ascii="Times New Roman" w:hAnsi="Times New Roman"/>
+          <w:color w:val="000000"/>
+          <w:szCs w:val="24"/>
+        </w:rPr>
+        <w:t>updated</w:t>
+      </w:r>
+      <w:r>
+        <w:rPr>
+          <w:rFonts w:ascii="Times New Roman" w:hAnsi="Times New Roman"/>
+          <w:color w:val="000000"/>
+          <w:szCs w:val="24"/>
+        </w:rPr>
+        <w:t xml:space="preserve"> BOM</w:t>
+      </w:r>
+      <w:r>
+        <w:rPr>
+          <w:rFonts w:ascii="Times New Roman" w:hAnsi="Times New Roman"/>
+          <w:color w:val="000000"/>
+          <w:szCs w:val="24"/>
+        </w:rPr>
+        <w:t xml:space="preserve"> </w:t>
+      </w:r>
+      <w:r>
+        <w:rPr>
+          <w:rFonts w:ascii="Times New Roman" w:hAnsi="Times New Roman"/>
+          <w:color w:val="000000"/>
+          <w:szCs w:val="24"/>
+        </w:rPr>
+        <w:t xml:space="preserve">to GitHub </w:t>
+      </w:r>
+      <w:r>
+        <w:rPr>
+          <w:rFonts w:ascii="Times New Roman" w:hAnsi="Times New Roman"/>
+          <w:color w:val="000000"/>
+          <w:szCs w:val="24"/>
+        </w:rPr>
+        <w:t xml:space="preserve">(Yes/No): </w:t>
       </w:r>
     </w:p>
     <w:p>
@@ -643,55 +699,7 @@
           <w:color w:val="000000"/>
           <w:szCs w:val="24"/>
         </w:rPr>
-        <w:t>I have pushed</w:t>
-      </w:r>
-      <w:r>
-        <w:rPr>
-          <w:rFonts w:ascii="Times New Roman" w:hAnsi="Times New Roman"/>
-          <w:color w:val="000000"/>
-          <w:szCs w:val="24"/>
-        </w:rPr>
-        <w:t xml:space="preserve"> my low-level header, code, and </w:t>
-      </w:r>
-      <w:r>
-        <w:rPr>
-          <w:rFonts w:ascii="Times New Roman" w:hAnsi="Times New Roman"/>
-          <w:color w:val="000000"/>
-          <w:szCs w:val="24"/>
-        </w:rPr>
-        <w:t xml:space="preserve">unit </w:t>
-      </w:r>
-      <w:r>
-        <w:rPr>
-          <w:rFonts w:ascii="Times New Roman" w:hAnsi="Times New Roman"/>
-          <w:color w:val="000000"/>
-          <w:szCs w:val="24"/>
-        </w:rPr>
-        <w:t>test files</w:t>
-      </w:r>
-      <w:r>
-        <w:rPr>
-          <w:rFonts w:ascii="Times New Roman" w:hAnsi="Times New Roman"/>
-          <w:color w:val="000000"/>
-          <w:szCs w:val="24"/>
-        </w:rPr>
-        <w:t xml:space="preserve"> </w:t>
-      </w:r>
-      <w:r>
-        <w:rPr>
-          <w:rFonts w:ascii="Times New Roman" w:hAnsi="Times New Roman"/>
-          <w:color w:val="000000"/>
-          <w:szCs w:val="24"/>
-        </w:rPr>
-        <w:t xml:space="preserve">to GitHub </w:t>
-      </w:r>
-      <w:r>
-        <w:rPr>
-          <w:rFonts w:ascii="Times New Roman" w:hAnsi="Times New Roman"/>
-          <w:color w:val="000000"/>
-          <w:szCs w:val="24"/>
-        </w:rPr>
-        <w:t xml:space="preserve">(Yes/No): </w:t>
+        <w:t xml:space="preserve">List the needed supply voltages and estimated current for each voltage (show how these were determined). </w:t>
       </w:r>
     </w:p>
     <w:p>
@@ -745,11 +753,113 @@
           <w:color w:val="000000"/>
           <w:szCs w:val="24"/>
         </w:rPr>
-        <w:t xml:space="preserve">Include results of unit testing. </w:t>
+        <w:t>I have pushed</w:t>
+      </w:r>
+      <w:r>
+        <w:rPr>
+          <w:rFonts w:ascii="Times New Roman" w:hAnsi="Times New Roman"/>
+          <w:color w:val="000000"/>
+          <w:szCs w:val="24"/>
+        </w:rPr>
+        <w:t xml:space="preserve"> my low-level header, code, and </w:t>
+      </w:r>
+      <w:r>
+        <w:rPr>
+          <w:rFonts w:ascii="Times New Roman" w:hAnsi="Times New Roman"/>
+          <w:color w:val="000000"/>
+          <w:szCs w:val="24"/>
+        </w:rPr>
+        <w:t xml:space="preserve">unit </w:t>
+      </w:r>
+      <w:r>
+        <w:rPr>
+          <w:rFonts w:ascii="Times New Roman" w:hAnsi="Times New Roman"/>
+          <w:color w:val="000000"/>
+          <w:szCs w:val="24"/>
+        </w:rPr>
+        <w:t>test files</w:t>
+      </w:r>
+      <w:r>
+        <w:rPr>
+          <w:rFonts w:ascii="Times New Roman" w:hAnsi="Times New Roman"/>
+          <w:color w:val="000000"/>
+          <w:szCs w:val="24"/>
+        </w:rPr>
+        <w:t xml:space="preserve"> </w:t>
+      </w:r>
+      <w:r>
+        <w:rPr>
+          <w:rFonts w:ascii="Times New Roman" w:hAnsi="Times New Roman"/>
+          <w:color w:val="000000"/>
+          <w:szCs w:val="24"/>
+        </w:rPr>
+        <w:t xml:space="preserve">to GitHub </w:t>
+      </w:r>
+      <w:r>
+        <w:rPr>
+          <w:rFonts w:ascii="Times New Roman" w:hAnsi="Times New Roman"/>
+          <w:color w:val="000000"/>
+          <w:szCs w:val="24"/>
+        </w:rPr>
+        <w:t xml:space="preserve">(Yes/No): </w:t>
       </w:r>
     </w:p>
     <w:p>
       <w:pPr>
+        <w:rPr>
+          <w:rFonts w:ascii="Times New Roman" w:hAnsi="Times New Roman"/>
+          <w:color w:val="000000"/>
+          <w:szCs w:val="24"/>
+        </w:rPr>
+      </w:pPr>
+    </w:p>
+    <w:p>
+      <w:pPr>
+        <w:rPr>
+          <w:rFonts w:ascii="Times New Roman" w:hAnsi="Times New Roman"/>
+          <w:color w:val="000000"/>
+          <w:szCs w:val="24"/>
+        </w:rPr>
+      </w:pPr>
+      <w:r>
+        <w:rPr>
+          <w:rFonts w:ascii="Times New Roman" w:hAnsi="Times New Roman"/>
+          <w:b/>
+          <w:bCs/>
+          <w:color w:val="000000"/>
+          <w:szCs w:val="24"/>
+        </w:rPr>
+        <w:t xml:space="preserve">Deliverable </w:t>
+      </w:r>
+      <w:r>
+        <w:rPr>
+          <w:rFonts w:ascii="Times New Roman" w:hAnsi="Times New Roman"/>
+          <w:b/>
+          <w:bCs/>
+          <w:color w:val="000000"/>
+          <w:szCs w:val="24"/>
+        </w:rPr>
+        <w:t>7</w:t>
+      </w:r>
+      <w:r>
+        <w:rPr>
+          <w:rFonts w:ascii="Times New Roman" w:hAnsi="Times New Roman"/>
+          <w:color w:val="000000"/>
+          <w:szCs w:val="24"/>
+        </w:rPr>
+        <w:t xml:space="preserve">: </w:t>
+      </w:r>
+      <w:r>
+        <w:rPr>
+          <w:rFonts w:ascii="Times New Roman" w:hAnsi="Times New Roman"/>
+          <w:color w:val="000000"/>
+          <w:szCs w:val="24"/>
+        </w:rPr>
+        <w:t xml:space="preserve">Include results of unit testing. </w:t>
+      </w:r>
+    </w:p>
+    <w:p>
+      <w:pPr>
         <w:spacing w:line="264" w:lineRule="auto"/>
         <w:jc w:val="both"/>
         <w:rPr>
@@ -787,7 +897,7 @@
           <w:color w:val="000000"/>
           <w:szCs w:val="24"/>
         </w:rPr>
-        <w:t>7</w:t>
+        <w:t>8</w:t>
       </w:r>
       <w:r>
         <w:rPr>
@@ -842,6 +952,60 @@
           <w:szCs w:val="24"/>
         </w:rPr>
       </w:pPr>
+    </w:p>
+    <w:p>
+      <w:pPr>
+        <w:spacing w:line="264" w:lineRule="auto"/>
+        <w:jc w:val="both"/>
+        <w:rPr>
+          <w:rFonts w:ascii="Times New Roman" w:hAnsi="Times New Roman"/>
+          <w:strike/>
+          <w:color w:val="000000"/>
+          <w:szCs w:val="24"/>
+        </w:rPr>
+      </w:pPr>
+      <w:r>
+        <w:rPr>
+          <w:rFonts w:ascii="Times New Roman" w:hAnsi="Times New Roman"/>
+          <w:b/>
+          <w:bCs/>
+          <w:strike/>
+          <w:color w:val="000000"/>
+          <w:szCs w:val="24"/>
+        </w:rPr>
+        <w:t xml:space="preserve">Deliverable </w:t>
+      </w:r>
+      <w:r>
+        <w:rPr>
+          <w:rFonts w:ascii="Times New Roman" w:hAnsi="Times New Roman"/>
+          <w:b/>
+          <w:bCs/>
+          <w:strike/>
+          <w:color w:val="000000"/>
+          <w:szCs w:val="24"/>
+        </w:rPr>
+        <w:t>9</w:t>
+      </w:r>
+      <w:r>
+        <w:rPr>
+          <w:rFonts w:ascii="Times New Roman" w:hAnsi="Times New Roman"/>
+          <w:b/>
+          <w:bCs/>
+          <w:strike/>
+          <w:color w:val="000000"/>
+          <w:szCs w:val="24"/>
+        </w:rPr>
+        <w:t xml:space="preserve"> (10pt EC):</w:t>
+      </w:r>
+      <w:r>
+        <w:rPr>
+          <w:rFonts w:ascii="Times New Roman" w:hAnsi="Times New Roman"/>
+          <w:strike/>
+          <w:color w:val="000000"/>
+          <w:szCs w:val="24"/>
+        </w:rPr>
+        <w:t xml:space="preserve"> single chip (points given in Lab 10 if the single chip works)</w:t>
+      </w:r>
     </w:p>
     <w:p>
       <w:pPr>

</xml_diff>